<commit_message>
Finalize CEAS Paper 3 package with Study 7 Zenodo DOI
</commit_message>
<xml_diff>
--- a/publication/Paper_3_Study_7/CEAS_Space_Journal/PORTAL_UPLOAD_PACKAGE/PAPER3_CEAS_MANUSCRIPT.docx
+++ b/publication/Paper_3_Study_7/CEAS_Space_Journal/PORTAL_UPLOAD_PACKAGE/PAPER3_CEAS_MANUSCRIPT.docx
@@ -2386,7 +2386,7 @@
     </w:p>
     <w:p>
       <w:r>
-        <w:t>The Study-7 protocol, canonical result records, policy summary, and separately implemented audit materials are publicly available in the mission-aware-satellite-cyber-recovery repository at https://github.com/Zartharas/mission-aware-satellite-cyber-recovery. The accepted execution is identified by workflow run 33689625480 and commit f1530b0b2e81a5916adaf7ce808075156424dfb5; frozen SHA-256 identities are recorded in study7/results/RESULTS_FREEZE.json. The accepted output artifact is hash-bound and a permanent archival deposit of the exact accepted bytes is planned before publication. No confidential, proprietary, or human-subject data are used.</w:t>
+        <w:t>The Study-7 protocol, canonical result records, policy summary, and separately implemented audit materials are publicly available in the mission-aware-satellite-cyber-recovery repository at https://github.com/Zartharas/mission-aware-satellite-cyber-recovery. The exact accepted Study-7 evidence is also preserved in a permanent Zenodo dataset deposit [9] (version DOI https://doi.org/10.5281/zenodo.22732060; concept DOI https://doi.org/10.5281/zenodo.22732059). The deposit preserves the accepted GitHub Actions artifact byte-for-byte and includes the exact observations, policy summary, trained-model parameters, execution report and provenance, implementation-independent repository audit output, and frozen protocol/results metadata. The accepted execution is identified by workflow run 33689625480 and commit f1530b0b2e81a5916adaf7ce808075156424dfb5; frozen SHA-256 identities are recorded in study7/results/RESULTS_FREEZE.json. No confidential, proprietary, or human-subject data are used.</w:t>
       </w:r>
     </w:p>
     <w:p>
@@ -2472,6 +2472,12 @@
       </w:pPr>
       <w:r>
         <w:t>8. Kuhn, N., Sanchez Gomez, B., Moreno Blasco, N., Caserman, P., Antonello, F.: Validation-gated continual learning for anomaly detection in satellite telemetry. Acta Astronaut. 249, 971-985 (2026). https://doi.org/10.1016/j.actaastro.2026.07.065</w:t>
+      </w:r>
+    </w:p>
+    <w:p>
+      <w:pPr/>
+      <w:r>
+        <w:t>9. Singh, A.: Mission-Aware Satellite Cyber Recovery - Study 7 Learned Selector Observability Evidence. Dataset, Zenodo, version 1.0.0 (2026). https://doi.org/10.5281/zenodo.22732060</w:t>
       </w:r>
     </w:p>
     <w:sectPr>

</xml_diff>